<commit_message>
Polish resume heading, dividers, and entry spacing
</commit_message>
<xml_diff>
--- a/resumes/Samya_Samanta_Synthetic_Organic_Chemist.docx
+++ b/resumes/Samya_Samanta_Synthetic_Organic_Chemist.docx
@@ -9,12 +9,12 @@
         <w:tabs>
           <w:tab w:pos="10858" w:val="right"/>
         </w:tabs>
-        <w:spacing w:after="100" w:line="460" w:lineRule="exact" w:before="0"/>
+        <w:spacing w:after="100" w:line="480" w:lineRule="exact" w:before="0"/>
         <w:jc w:val="center"/>
       </w:pPr>
       <w:r>
         <w:rPr>
-          <w:rFonts w:eastAsia="Arial" w:cs="Arial"/>
+          <w:rFonts w:eastAsia="Palatino" w:cs="Palatino" w:ascii="Palatino" w:hAnsi="Palatino"/>
           <w:color w:val="253D50"/>
           <w:sz w:val="40"/>
           <w:szCs w:val="36"/>
@@ -76,9 +76,12 @@
         <w:tabs>
           <w:tab w:pos="10858" w:val="right"/>
         </w:tabs>
-        <w:spacing w:before="160" w:after="80" w:line="260" w:lineRule="exact"/>
+        <w:spacing w:before="140" w:after="80" w:line="260" w:lineRule="exact"/>
         <w:ind w:left="0" w:firstLine="0"/>
         <w:jc w:val="left"/>
+        <w:pBdr>
+          <w:bottom w:val="single" w:sz="3" w:space="2" w:color="CCD4DB"/>
+        </w:pBdr>
       </w:pPr>
       <w:r>
         <w:rPr>
@@ -118,9 +121,12 @@
         <w:tabs>
           <w:tab w:pos="10858" w:val="right"/>
         </w:tabs>
-        <w:spacing w:before="160" w:after="80" w:line="260" w:lineRule="exact"/>
+        <w:spacing w:before="140" w:after="80" w:line="260" w:lineRule="exact"/>
         <w:ind w:left="0" w:firstLine="0"/>
         <w:jc w:val="left"/>
+        <w:pBdr>
+          <w:bottom w:val="single" w:sz="3" w:space="2" w:color="CCD4DB"/>
+        </w:pBdr>
       </w:pPr>
       <w:r>
         <w:rPr>
@@ -627,9 +633,12 @@
         <w:tabs>
           <w:tab w:pos="10858" w:val="right"/>
         </w:tabs>
-        <w:spacing w:before="160" w:after="80" w:line="260" w:lineRule="exact"/>
+        <w:spacing w:before="140" w:after="80" w:line="260" w:lineRule="exact"/>
         <w:ind w:left="0" w:firstLine="0"/>
         <w:jc w:val="left"/>
+        <w:pBdr>
+          <w:bottom w:val="single" w:sz="3" w:space="2" w:color="CCD4DB"/>
+        </w:pBdr>
       </w:pPr>
       <w:r>
         <w:rPr>
@@ -649,7 +658,7 @@
         <w:tabs>
           <w:tab w:pos="10858" w:val="right"/>
         </w:tabs>
-        <w:spacing w:after="40" w:line="240" w:lineRule="exact" w:before="80"/>
+        <w:spacing w:after="60" w:line="240" w:lineRule="exact" w:before="110"/>
         <w:ind w:left="0" w:firstLine="0"/>
         <w:jc w:val="left"/>
       </w:pPr>
@@ -725,7 +734,8 @@
         <w:tabs>
           <w:tab w:pos="10858" w:val="right"/>
         </w:tabs>
-        <w:spacing w:after="50" w:line="240" w:lineRule="exact" w:before="0"/>
+        <w:spacing w:after="40" w:line="230" w:lineRule="exact" w:before="0"/>
+        <w:ind w:left="216" w:hanging="158"/>
         <w:jc w:val="left"/>
       </w:pPr>
       <w:r>
@@ -926,7 +936,8 @@
         <w:tabs>
           <w:tab w:pos="10858" w:val="right"/>
         </w:tabs>
-        <w:spacing w:after="50" w:line="240" w:lineRule="exact" w:before="0"/>
+        <w:spacing w:after="40" w:line="230" w:lineRule="exact" w:before="0"/>
+        <w:ind w:left="216" w:hanging="158"/>
         <w:jc w:val="left"/>
       </w:pPr>
       <w:r>
@@ -1043,7 +1054,8 @@
         <w:tabs>
           <w:tab w:pos="10858" w:val="right"/>
         </w:tabs>
-        <w:spacing w:after="50" w:line="240" w:lineRule="exact" w:before="0"/>
+        <w:spacing w:after="40" w:line="230" w:lineRule="exact" w:before="0"/>
+        <w:ind w:left="216" w:hanging="158"/>
         <w:jc w:val="left"/>
       </w:pPr>
       <w:r>
@@ -1228,7 +1240,8 @@
         <w:tabs>
           <w:tab w:pos="10858" w:val="right"/>
         </w:tabs>
-        <w:spacing w:after="50" w:line="240" w:lineRule="exact" w:before="0"/>
+        <w:spacing w:after="40" w:line="230" w:lineRule="exact" w:before="0"/>
+        <w:ind w:left="216" w:hanging="158"/>
         <w:jc w:val="left"/>
       </w:pPr>
       <w:r>
@@ -1297,7 +1310,8 @@
         <w:tabs>
           <w:tab w:pos="10858" w:val="right"/>
         </w:tabs>
-        <w:spacing w:after="50" w:line="240" w:lineRule="exact" w:before="0"/>
+        <w:spacing w:after="40" w:line="230" w:lineRule="exact" w:before="0"/>
+        <w:ind w:left="216" w:hanging="158"/>
         <w:jc w:val="left"/>
       </w:pPr>
       <w:r>
@@ -1317,7 +1331,7 @@
         <w:tabs>
           <w:tab w:pos="10858" w:val="right"/>
         </w:tabs>
-        <w:spacing w:after="40" w:line="240" w:lineRule="exact" w:before="80"/>
+        <w:spacing w:after="60" w:line="240" w:lineRule="exact" w:before="110"/>
         <w:ind w:left="0" w:firstLine="0"/>
         <w:jc w:val="left"/>
       </w:pPr>
@@ -1392,7 +1406,8 @@
         <w:tabs>
           <w:tab w:pos="10858" w:val="right"/>
         </w:tabs>
-        <w:spacing w:after="50" w:line="240" w:lineRule="exact" w:before="0"/>
+        <w:spacing w:after="40" w:line="230" w:lineRule="exact" w:before="0"/>
+        <w:ind w:left="216" w:hanging="158"/>
         <w:jc w:val="left"/>
       </w:pPr>
       <w:r>
@@ -1501,7 +1516,7 @@
         <w:tabs>
           <w:tab w:pos="10858" w:val="right"/>
         </w:tabs>
-        <w:spacing w:after="40" w:line="240" w:lineRule="exact" w:before="80"/>
+        <w:spacing w:after="60" w:line="240" w:lineRule="exact" w:before="110"/>
         <w:ind w:left="0" w:firstLine="0"/>
         <w:jc w:val="left"/>
       </w:pPr>
@@ -1563,7 +1578,8 @@
         <w:tabs>
           <w:tab w:pos="10858" w:val="right"/>
         </w:tabs>
-        <w:spacing w:after="50" w:line="240" w:lineRule="exact" w:before="0"/>
+        <w:spacing w:after="40" w:line="230" w:lineRule="exact" w:before="0"/>
+        <w:ind w:left="216" w:hanging="158"/>
         <w:jc w:val="left"/>
       </w:pPr>
       <w:r>
@@ -1713,7 +1729,7 @@
         <w:tabs>
           <w:tab w:pos="10858" w:val="right"/>
         </w:tabs>
-        <w:spacing w:after="40" w:line="240" w:lineRule="exact" w:before="80"/>
+        <w:spacing w:after="60" w:line="240" w:lineRule="exact" w:before="110"/>
         <w:ind w:left="0" w:firstLine="0"/>
         <w:jc w:val="left"/>
       </w:pPr>
@@ -1777,7 +1793,8 @@
         <w:tabs>
           <w:tab w:pos="10858" w:val="right"/>
         </w:tabs>
-        <w:spacing w:after="50" w:line="240" w:lineRule="exact" w:before="0"/>
+        <w:spacing w:after="40" w:line="230" w:lineRule="exact" w:before="0"/>
+        <w:ind w:left="216" w:hanging="158"/>
         <w:jc w:val="left"/>
       </w:pPr>
       <w:r>
@@ -1838,7 +1855,7 @@
         <w:tabs>
           <w:tab w:pos="10858" w:val="right"/>
         </w:tabs>
-        <w:spacing w:after="40" w:line="240" w:lineRule="exact" w:before="80"/>
+        <w:spacing w:after="60" w:line="240" w:lineRule="exact" w:before="110"/>
         <w:ind w:left="0" w:firstLine="0"/>
         <w:jc w:val="left"/>
       </w:pPr>
@@ -1928,7 +1945,8 @@
         <w:tabs>
           <w:tab w:pos="10858" w:val="right"/>
         </w:tabs>
-        <w:spacing w:after="50" w:line="240" w:lineRule="exact" w:before="0"/>
+        <w:spacing w:after="40" w:line="230" w:lineRule="exact" w:before="0"/>
+        <w:ind w:left="216" w:hanging="158"/>
         <w:jc w:val="left"/>
       </w:pPr>
       <w:r>
@@ -1968,9 +1986,12 @@
         <w:tabs>
           <w:tab w:pos="10858" w:val="right"/>
         </w:tabs>
-        <w:spacing w:before="160" w:after="80" w:line="260" w:lineRule="exact"/>
+        <w:spacing w:before="140" w:after="80" w:line="260" w:lineRule="exact"/>
         <w:ind w:left="0" w:firstLine="0"/>
         <w:jc w:val="left"/>
+        <w:pBdr>
+          <w:bottom w:val="single" w:sz="3" w:space="2" w:color="CCD4DB"/>
+        </w:pBdr>
       </w:pPr>
       <w:r>
         <w:rPr>
@@ -2963,9 +2984,12 @@
         <w:tabs>
           <w:tab w:pos="10858" w:val="right"/>
         </w:tabs>
-        <w:spacing w:before="160" w:after="80" w:line="260" w:lineRule="exact"/>
+        <w:spacing w:before="140" w:after="80" w:line="260" w:lineRule="exact"/>
         <w:ind w:left="0" w:firstLine="0"/>
         <w:jc w:val="left"/>
+        <w:pBdr>
+          <w:bottom w:val="single" w:sz="3" w:space="2" w:color="CCD4DB"/>
+        </w:pBdr>
       </w:pPr>
       <w:r>
         <w:rPr>
@@ -3318,9 +3342,12 @@
         <w:tabs>
           <w:tab w:pos="10858" w:val="right"/>
         </w:tabs>
-        <w:spacing w:before="160" w:after="80" w:line="260" w:lineRule="exact"/>
+        <w:spacing w:before="140" w:after="80" w:line="260" w:lineRule="exact"/>
         <w:ind w:left="0" w:firstLine="0"/>
         <w:jc w:val="left"/>
+        <w:pBdr>
+          <w:bottom w:val="single" w:sz="3" w:space="2" w:color="CCD4DB"/>
+        </w:pBdr>
       </w:pPr>
       <w:r>
         <w:rPr>
@@ -3934,9 +3961,12 @@
         <w:tabs>
           <w:tab w:pos="10858" w:val="right"/>
         </w:tabs>
-        <w:spacing w:before="160" w:after="80" w:line="260" w:lineRule="exact"/>
+        <w:spacing w:before="140" w:after="80" w:line="260" w:lineRule="exact"/>
         <w:ind w:left="0" w:firstLine="0"/>
         <w:jc w:val="left"/>
+        <w:pBdr>
+          <w:bottom w:val="single" w:sz="3" w:space="2" w:color="CCD4DB"/>
+        </w:pBdr>
       </w:pPr>
       <w:r>
         <w:rPr>
@@ -4168,9 +4198,12 @@
         <w:tabs>
           <w:tab w:pos="10858" w:val="right"/>
         </w:tabs>
-        <w:spacing w:before="160" w:after="80" w:line="260" w:lineRule="exact"/>
+        <w:spacing w:before="140" w:after="80" w:line="260" w:lineRule="exact"/>
         <w:ind w:left="0" w:firstLine="0"/>
         <w:jc w:val="left"/>
+        <w:pBdr>
+          <w:bottom w:val="single" w:sz="3" w:space="2" w:color="CCD4DB"/>
+        </w:pBdr>
       </w:pPr>
       <w:r>
         <w:rPr>
@@ -4749,9 +4782,12 @@
         <w:tabs>
           <w:tab w:pos="10858" w:val="right"/>
         </w:tabs>
-        <w:spacing w:before="160" w:after="80" w:line="260" w:lineRule="exact"/>
+        <w:spacing w:before="140" w:after="80" w:line="260" w:lineRule="exact"/>
         <w:ind w:left="0" w:firstLine="0"/>
         <w:jc w:val="left"/>
+        <w:pBdr>
+          <w:bottom w:val="single" w:sz="3" w:space="2" w:color="CCD4DB"/>
+        </w:pBdr>
       </w:pPr>
       <w:r>
         <w:rPr>
@@ -4771,7 +4807,7 @@
         <w:tabs>
           <w:tab w:pos="10858" w:val="right"/>
         </w:tabs>
-        <w:spacing w:after="40" w:line="240" w:lineRule="exact" w:before="80"/>
+        <w:spacing w:after="60" w:line="240" w:lineRule="exact" w:before="110"/>
         <w:ind w:left="0" w:firstLine="0"/>
         <w:jc w:val="left"/>
       </w:pPr>
@@ -4835,7 +4871,8 @@
         <w:tabs>
           <w:tab w:pos="10858" w:val="right"/>
         </w:tabs>
-        <w:spacing w:after="50" w:line="240" w:lineRule="exact" w:before="0"/>
+        <w:spacing w:after="40" w:line="230" w:lineRule="exact" w:before="0"/>
+        <w:ind w:left="216" w:hanging="158"/>
         <w:jc w:val="left"/>
       </w:pPr>
       <w:r>
@@ -4860,7 +4897,8 @@
         <w:tabs>
           <w:tab w:pos="10858" w:val="right"/>
         </w:tabs>
-        <w:spacing w:after="50" w:line="240" w:lineRule="exact" w:before="0"/>
+        <w:spacing w:after="40" w:line="230" w:lineRule="exact" w:before="0"/>
+        <w:ind w:left="216" w:hanging="158"/>
         <w:jc w:val="left"/>
       </w:pPr>
       <w:r>
@@ -4881,7 +4919,7 @@
         <w:tabs>
           <w:tab w:pos="10858" w:val="right"/>
         </w:tabs>
-        <w:spacing w:after="40" w:line="240" w:lineRule="exact" w:before="80"/>
+        <w:spacing w:after="60" w:line="240" w:lineRule="exact" w:before="110"/>
         <w:ind w:left="0" w:firstLine="0"/>
         <w:jc w:val="left"/>
       </w:pPr>
@@ -4958,7 +4996,8 @@
         <w:tabs>
           <w:tab w:pos="10858" w:val="right"/>
         </w:tabs>
-        <w:spacing w:after="50" w:line="240" w:lineRule="exact" w:before="0"/>
+        <w:spacing w:after="40" w:line="230" w:lineRule="exact" w:before="0"/>
+        <w:ind w:left="216" w:hanging="158"/>
         <w:jc w:val="left"/>
       </w:pPr>
       <w:r>
@@ -4979,7 +5018,7 @@
         <w:tabs>
           <w:tab w:pos="10858" w:val="right"/>
         </w:tabs>
-        <w:spacing w:after="40" w:line="240" w:lineRule="exact" w:before="80"/>
+        <w:spacing w:after="60" w:line="240" w:lineRule="exact" w:before="110"/>
         <w:ind w:left="0" w:firstLine="0"/>
         <w:jc w:val="left"/>
       </w:pPr>
@@ -5097,7 +5136,8 @@
         <w:tabs>
           <w:tab w:pos="10858" w:val="right"/>
         </w:tabs>
-        <w:spacing w:after="50" w:line="240" w:lineRule="exact" w:before="0"/>
+        <w:spacing w:after="40" w:line="230" w:lineRule="exact" w:before="0"/>
+        <w:ind w:left="216" w:hanging="158"/>
         <w:jc w:val="left"/>
       </w:pPr>
       <w:r>
@@ -5142,7 +5182,8 @@
         <w:tabs>
           <w:tab w:pos="10858" w:val="right"/>
         </w:tabs>
-        <w:spacing w:after="50" w:line="240" w:lineRule="exact" w:before="0"/>
+        <w:spacing w:after="40" w:line="230" w:lineRule="exact" w:before="0"/>
+        <w:ind w:left="216" w:hanging="158"/>
         <w:jc w:val="left"/>
       </w:pPr>
       <w:r>
@@ -5183,7 +5224,7 @@
         <w:tabs>
           <w:tab w:pos="10858" w:val="right"/>
         </w:tabs>
-        <w:spacing w:after="40" w:line="240" w:lineRule="exact" w:before="80"/>
+        <w:spacing w:after="60" w:line="240" w:lineRule="exact" w:before="110"/>
         <w:ind w:left="0" w:firstLine="0"/>
         <w:jc w:val="left"/>
       </w:pPr>
@@ -5247,7 +5288,8 @@
         <w:tabs>
           <w:tab w:pos="10858" w:val="right"/>
         </w:tabs>
-        <w:spacing w:after="50" w:line="240" w:lineRule="exact" w:before="0"/>
+        <w:spacing w:after="40" w:line="230" w:lineRule="exact" w:before="0"/>
+        <w:ind w:left="216" w:hanging="158"/>
         <w:jc w:val="left"/>
       </w:pPr>
       <w:r>

</xml_diff>